<commit_message>
feat(m14): harden release packaging and formal delivery
</commit_message>
<xml_diff>
--- a/deliverables/business-user-manual.docx
+++ b/deliverables/business-user-manual.docx
@@ -1511,7 +1511,35 @@
           <w:b w:val="0"/>
           <w:i w:val="0"/>
         </w:rPr>
-        <w:t>错误表会显示源行、字段、错误类型和中文说明。对页面列出的可修正错误，可填写目标字段修正值，再点击“按修正值重新全量校验”。修正只作用于本次导入结果；原始文件和原始文本仍会保留用于追溯。</w:t>
+        <w:t xml:space="preserve">校验未通过时页面弹出“文件校验未通过”，显示文件名、总行数、错误数和首批中文错误，并明确原文件尚未导入。按 </w:t>
+      </w:r>
+      <w:r>
+        <w:rPr>
+          <w:rFonts w:ascii="Consolas" w:hAnsi="Consolas" w:eastAsia="Microsoft YaHei"/>
+          <w:b w:val="0"/>
+          <w:i w:val="0"/>
+          <w:color w:val="464646"/>
+          <w:sz w:val="19"/>
+        </w:rPr>
+        <w:t>Esc</w:t>
+      </w:r>
+      <w:r>
+        <w:rPr>
+          <w:rFonts w:ascii="Arial" w:hAnsi="Arial" w:eastAsia="Microsoft YaHei"/>
+          <w:b w:val="0"/>
+          <w:i w:val="0"/>
+        </w:rPr>
+        <w:t xml:space="preserve"> 或“关闭校验结果”返回导入区；存在可修正错误时点击“前往修正”，焦点会移动到页面内异常行修正区。弹窗只用于快速定位，关闭后完整错误表仍保留源行、字段、错误类型和中文说明。</w:t>
+      </w:r>
+    </w:p>
+    <w:p>
+      <w:r>
+        <w:rPr>
+          <w:rFonts w:ascii="Arial" w:hAnsi="Arial" w:eastAsia="Microsoft YaHei"/>
+          <w:b w:val="0"/>
+          <w:i w:val="0"/>
+        </w:rPr>
+        <w:t>对页面列出的可修正错误，可填写目标字段修正值，再点击“按修正值重新全量校验”。修正只作用于本次导入结果；原始文件和原始文本仍会保留用于追溯。</w:t>
       </w:r>
     </w:p>
     <w:p>
@@ -1644,7 +1672,7 @@
           <w:b w:val="0"/>
           <w:i w:val="0"/>
         </w:rPr>
-        <w:t>小时趋势；</w:t>
+        <w:t>带时间轴、峰值刻度和可展开数据表的小时趋势折线；</w:t>
       </w:r>
     </w:p>
     <w:p>
@@ -1670,7 +1698,7 @@
           <w:b w:val="0"/>
           <w:i w:val="0"/>
         </w:rPr>
-        <w:t>报警类型及原因建议分布。</w:t>
+        <w:t>报警类型环形占比及其数量/百分比图例、原因建议分布。</w:t>
       </w:r>
     </w:p>
     <w:p>
@@ -1680,7 +1708,7 @@
           <w:b w:val="0"/>
           <w:i w:val="0"/>
         </w:rPr>
-        <w:t>“打印或保存为 PDF”使用浏览器打印功能，只保存当前看板；“导出看板数据”下载 CSV。它们不等同于下方的完整分析报告。</w:t>
+        <w:t>“打印或保存为 PDF”使用浏览器打印功能，只保存当前看板；“导出看板数据”下载带 UTF-8 BOM 的 CSV，包含报警总数、三种处置状态、关联事件链、小时趋势和全部分布。它们不等同于下方的完整分析报告。</w:t>
       </w:r>
     </w:p>
     <w:p>
@@ -2931,7 +2959,7 @@
           <w:b w:val="0"/>
           <w:i w:val="0"/>
         </w:rPr>
-        <w:t>本节只由实际执行终验的业务人员填写。自动化和开发人员不得预填 PASS，不得用截图、旧版本结果或口头确认代替本记录。若操作中需要说明书之外的口头补充，应记录为问题并判定说明书独立可用性失败。</w:t>
+        <w:t>本节只由实际执行终验的业务人员填写。项目研发人员不得预填 PASS，不得用截图、旧版本结果或口头确认代替本记录。若操作中需要说明书之外的口头补充，应记录为问题并判定说明书独立可用性失败。</w:t>
       </w:r>
     </w:p>
     <w:p>
@@ -4246,6 +4274,29 @@
       </w:rPr>
       <w:t>报警管理系统 · 文档日期 2026-08-27</w:t>
     </w:r>
+    <w:r>
+      <w:t xml:space="preserve"> · 第 </w:t>
+    </w:r>
+    <w:r>
+      <w:fldChar w:fldCharType="begin"/>
+      <w:instrText xml:space="preserve"> PAGE </w:instrText>
+      <w:fldChar w:fldCharType="separate"/>
+      <w:t>1</w:t>
+      <w:fldChar w:fldCharType="end"/>
+    </w:r>
+    <w:r>
+      <w:t xml:space="preserve"> / </w:t>
+    </w:r>
+    <w:r>
+      <w:fldChar w:fldCharType="begin"/>
+      <w:instrText xml:space="preserve"> NUMPAGES </w:instrText>
+      <w:fldChar w:fldCharType="separate"/>
+      <w:t>1</w:t>
+      <w:fldChar w:fldCharType="end"/>
+    </w:r>
+    <w:r>
+      <w:t xml:space="preserve"> 页</w:t>
+    </w:r>
   </w:p>
 </w:ftr>
 </file>

</xml_diff>

<commit_message>
release: finalize v1.0.0 documentation and approval
</commit_message>
<xml_diff>
--- a/deliverables/business-user-manual.docx
+++ b/deliverables/business-user-manual.docx
@@ -2949,7 +2949,7 @@
           <w:b w:val="0"/>
           <w:i w:val="0"/>
         </w:rPr>
-        <w:t>15. M14 非技术业务人员终验记录</w:t>
+        <w:t>15. 面向甲方的十五分钟演示脚本</w:t>
       </w:r>
     </w:p>
     <w:p>
@@ -2959,495 +2959,7 @@
           <w:b w:val="0"/>
           <w:i w:val="0"/>
         </w:rPr>
-        <w:t>本节只由实际执行终验的业务人员填写。项目研发人员不得预填 PASS，不得用截图、旧版本结果或口头确认代替本记录。若操作中需要说明书之外的口头补充，应记录为问题并判定说明书独立可用性失败。</w:t>
-      </w:r>
-    </w:p>
-    <w:p>
-      <w:pPr>
-        <w:pStyle w:val="Heading3"/>
-      </w:pPr>
-      <w:r>
-        <w:rPr>
-          <w:rFonts w:ascii="Arial" w:hAnsi="Arial" w:eastAsia="Microsoft YaHei"/>
-          <w:b w:val="0"/>
-          <w:i w:val="0"/>
-        </w:rPr>
-        <w:t>15.1 候选与环境绑定</w:t>
-      </w:r>
-    </w:p>
-    <w:tbl>
-      <w:tblPr>
-        <w:tblStyle w:val="TableGrid"/>
-        <w:tblW w:type="auto" w:w="0"/>
-        <w:tblLayout w:type="autofit"/>
-        <w:tblLook w:firstColumn="1" w:firstRow="1" w:lastColumn="0" w:lastRow="0" w:noHBand="0" w:noVBand="1" w:val="04A0"/>
-      </w:tblPr>
-      <w:tblGrid>
-        <w:gridCol w:w="4649"/>
-        <w:gridCol w:w="4649"/>
-      </w:tblGrid>
-      <w:tr>
-        <w:trPr>
-          <w:tblHeader w:val="true"/>
-        </w:trPr>
-        <w:tc>
-          <w:tcPr>
-            <w:tcW w:type="dxa" w:w="4649"/>
-            <w:vAlign w:val="center"/>
-            <w:shd w:fill="D9EAF7"/>
-          </w:tcPr>
-          <w:p>
-            <w:r>
-              <w:rPr>
-                <w:rFonts w:ascii="Arial" w:hAnsi="Arial" w:eastAsia="Microsoft YaHei"/>
-                <w:b/>
-                <w:i w:val="0"/>
-              </w:rPr>
-              <w:t>字段</w:t>
-            </w:r>
-          </w:p>
-        </w:tc>
-        <w:tc>
-          <w:tcPr>
-            <w:tcW w:type="dxa" w:w="4649"/>
-            <w:vAlign w:val="center"/>
-            <w:shd w:fill="D9EAF7"/>
-          </w:tcPr>
-          <w:p>
-            <w:r>
-              <w:rPr>
-                <w:rFonts w:ascii="Arial" w:hAnsi="Arial" w:eastAsia="Microsoft YaHei"/>
-                <w:b/>
-                <w:i w:val="0"/>
-              </w:rPr>
-              <w:t>人工填写</w:t>
-            </w:r>
-          </w:p>
-        </w:tc>
-      </w:tr>
-      <w:tr>
-        <w:tc>
-          <w:tcPr>
-            <w:tcW w:type="dxa" w:w="4649"/>
-            <w:vAlign w:val="center"/>
-          </w:tcPr>
-          <w:p>
-            <w:r>
-              <w:rPr>
-                <w:rFonts w:ascii="Arial" w:hAnsi="Arial" w:eastAsia="Microsoft YaHei"/>
-                <w:b w:val="0"/>
-                <w:i w:val="0"/>
-              </w:rPr>
-              <w:t>被测完整 Git 提交（40 位）</w:t>
-            </w:r>
-          </w:p>
-        </w:tc>
-        <w:tc>
-          <w:tcPr>
-            <w:tcW w:type="dxa" w:w="4649"/>
-            <w:vAlign w:val="center"/>
-          </w:tcPr>
-          <w:p/>
-        </w:tc>
-      </w:tr>
-      <w:tr>
-        <w:tc>
-          <w:tcPr>
-            <w:tcW w:type="dxa" w:w="4649"/>
-            <w:vAlign w:val="center"/>
-          </w:tcPr>
-          <w:p>
-            <w:r>
-              <w:rPr>
-                <w:rFonts w:ascii="Arial" w:hAnsi="Arial" w:eastAsia="Microsoft YaHei"/>
-                <w:b w:val="0"/>
-                <w:i w:val="0"/>
-              </w:rPr>
-              <w:t>Windows ZIP 完整路径</w:t>
-            </w:r>
-          </w:p>
-        </w:tc>
-        <w:tc>
-          <w:tcPr>
-            <w:tcW w:type="dxa" w:w="4649"/>
-            <w:vAlign w:val="center"/>
-          </w:tcPr>
-          <w:p/>
-        </w:tc>
-      </w:tr>
-      <w:tr>
-        <w:tc>
-          <w:tcPr>
-            <w:tcW w:type="dxa" w:w="4649"/>
-            <w:vAlign w:val="center"/>
-          </w:tcPr>
-          <w:p>
-            <w:r>
-              <w:rPr>
-                <w:rFonts w:ascii="Arial" w:hAnsi="Arial" w:eastAsia="Microsoft YaHei"/>
-                <w:b w:val="0"/>
-                <w:i w:val="0"/>
-              </w:rPr>
-              <w:t>ZIP SHA-256</w:t>
-            </w:r>
-          </w:p>
-        </w:tc>
-        <w:tc>
-          <w:tcPr>
-            <w:tcW w:type="dxa" w:w="4649"/>
-            <w:vAlign w:val="center"/>
-          </w:tcPr>
-          <w:p/>
-        </w:tc>
-      </w:tr>
-      <w:tr>
-        <w:tc>
-          <w:tcPr>
-            <w:tcW w:type="dxa" w:w="4649"/>
-            <w:vAlign w:val="center"/>
-          </w:tcPr>
-          <w:p>
-            <w:r>
-              <w:rPr>
-                <w:rFonts w:ascii="Consolas" w:hAnsi="Consolas" w:eastAsia="Microsoft YaHei"/>
-                <w:b w:val="0"/>
-                <w:i w:val="0"/>
-                <w:color w:val="464646"/>
-                <w:sz w:val="19"/>
-              </w:rPr>
-              <w:t>business-release-summary.json</w:t>
-            </w:r>
-            <w:r>
-              <w:rPr>
-                <w:rFonts w:ascii="Arial" w:hAnsi="Arial" w:eastAsia="Microsoft YaHei"/>
-                <w:b w:val="0"/>
-                <w:i w:val="0"/>
-              </w:rPr>
-              <w:t xml:space="preserve"> 路径</w:t>
-            </w:r>
-          </w:p>
-        </w:tc>
-        <w:tc>
-          <w:tcPr>
-            <w:tcW w:type="dxa" w:w="4649"/>
-            <w:vAlign w:val="center"/>
-          </w:tcPr>
-          <w:p/>
-        </w:tc>
-      </w:tr>
-      <w:tr>
-        <w:tc>
-          <w:tcPr>
-            <w:tcW w:type="dxa" w:w="4649"/>
-            <w:vAlign w:val="center"/>
-          </w:tcPr>
-          <w:p>
-            <w:r>
-              <w:rPr>
-                <w:rFonts w:ascii="Arial" w:hAnsi="Arial" w:eastAsia="Microsoft YaHei"/>
-                <w:b w:val="0"/>
-                <w:i w:val="0"/>
-              </w:rPr>
-              <w:t>Windows 11 x64 版本</w:t>
-            </w:r>
-          </w:p>
-        </w:tc>
-        <w:tc>
-          <w:tcPr>
-            <w:tcW w:type="dxa" w:w="4649"/>
-            <w:vAlign w:val="center"/>
-          </w:tcPr>
-          <w:p/>
-        </w:tc>
-      </w:tr>
-      <w:tr>
-        <w:tc>
-          <w:tcPr>
-            <w:tcW w:type="dxa" w:w="4649"/>
-            <w:vAlign w:val="center"/>
-          </w:tcPr>
-          <w:p>
-            <w:r>
-              <w:rPr>
-                <w:rFonts w:ascii="Arial" w:hAnsi="Arial" w:eastAsia="Microsoft YaHei"/>
-                <w:b w:val="0"/>
-                <w:i w:val="0"/>
-              </w:rPr>
-              <w:t>浏览器及版本</w:t>
-            </w:r>
-          </w:p>
-        </w:tc>
-        <w:tc>
-          <w:tcPr>
-            <w:tcW w:type="dxa" w:w="4649"/>
-            <w:vAlign w:val="center"/>
-          </w:tcPr>
-          <w:p/>
-        </w:tc>
-      </w:tr>
-      <w:tr>
-        <w:tc>
-          <w:tcPr>
-            <w:tcW w:type="dxa" w:w="4649"/>
-            <w:vAlign w:val="center"/>
-          </w:tcPr>
-          <w:p>
-            <w:r>
-              <w:rPr>
-                <w:rFonts w:ascii="Arial" w:hAnsi="Arial" w:eastAsia="Microsoft YaHei"/>
-                <w:b w:val="0"/>
-                <w:i w:val="0"/>
-              </w:rPr>
-              <w:t>PDF 阅读器及版本</w:t>
-            </w:r>
-          </w:p>
-        </w:tc>
-        <w:tc>
-          <w:tcPr>
-            <w:tcW w:type="dxa" w:w="4649"/>
-            <w:vAlign w:val="center"/>
-          </w:tcPr>
-          <w:p/>
-        </w:tc>
-      </w:tr>
-      <w:tr>
-        <w:tc>
-          <w:tcPr>
-            <w:tcW w:type="dxa" w:w="4649"/>
-            <w:vAlign w:val="center"/>
-          </w:tcPr>
-          <w:p>
-            <w:r>
-              <w:rPr>
-                <w:rFonts w:ascii="Arial" w:hAnsi="Arial" w:eastAsia="Microsoft YaHei"/>
-                <w:b w:val="0"/>
-                <w:i w:val="0"/>
-              </w:rPr>
-              <w:t>XLSX 打开软件及版本</w:t>
-            </w:r>
-          </w:p>
-        </w:tc>
-        <w:tc>
-          <w:tcPr>
-            <w:tcW w:type="dxa" w:w="4649"/>
-            <w:vAlign w:val="center"/>
-          </w:tcPr>
-          <w:p/>
-        </w:tc>
-      </w:tr>
-      <w:tr>
-        <w:tc>
-          <w:tcPr>
-            <w:tcW w:type="dxa" w:w="4649"/>
-            <w:vAlign w:val="center"/>
-          </w:tcPr>
-          <w:p>
-            <w:r>
-              <w:rPr>
-                <w:rFonts w:ascii="Arial" w:hAnsi="Arial" w:eastAsia="Microsoft YaHei"/>
-                <w:b w:val="0"/>
-                <w:i w:val="0"/>
-              </w:rPr>
-              <w:t>全新解压目录</w:t>
-            </w:r>
-          </w:p>
-        </w:tc>
-        <w:tc>
-          <w:tcPr>
-            <w:tcW w:type="dxa" w:w="4649"/>
-            <w:vAlign w:val="center"/>
-          </w:tcPr>
-          <w:p/>
-        </w:tc>
-      </w:tr>
-      <w:tr>
-        <w:tc>
-          <w:tcPr>
-            <w:tcW w:type="dxa" w:w="4649"/>
-            <w:vAlign w:val="center"/>
-          </w:tcPr>
-          <w:p>
-            <w:r>
-              <w:rPr>
-                <w:rFonts w:ascii="Arial" w:hAnsi="Arial" w:eastAsia="Microsoft YaHei"/>
-                <w:b w:val="0"/>
-                <w:i w:val="0"/>
-              </w:rPr>
-              <w:t>验收人姓名/工号</w:t>
-            </w:r>
-          </w:p>
-        </w:tc>
-        <w:tc>
-          <w:tcPr>
-            <w:tcW w:type="dxa" w:w="4649"/>
-            <w:vAlign w:val="center"/>
-          </w:tcPr>
-          <w:p/>
-        </w:tc>
-      </w:tr>
-      <w:tr>
-        <w:tc>
-          <w:tcPr>
-            <w:tcW w:type="dxa" w:w="4649"/>
-            <w:vAlign w:val="center"/>
-          </w:tcPr>
-          <w:p>
-            <w:r>
-              <w:rPr>
-                <w:rFonts w:ascii="Arial" w:hAnsi="Arial" w:eastAsia="Microsoft YaHei"/>
-                <w:b w:val="0"/>
-                <w:i w:val="0"/>
-              </w:rPr>
-              <w:t>验收人业务角色</w:t>
-            </w:r>
-          </w:p>
-        </w:tc>
-        <w:tc>
-          <w:tcPr>
-            <w:tcW w:type="dxa" w:w="4649"/>
-            <w:vAlign w:val="center"/>
-          </w:tcPr>
-          <w:p/>
-        </w:tc>
-      </w:tr>
-      <w:tr>
-        <w:tc>
-          <w:tcPr>
-            <w:tcW w:type="dxa" w:w="4649"/>
-            <w:vAlign w:val="center"/>
-          </w:tcPr>
-          <w:p>
-            <w:r>
-              <w:rPr>
-                <w:rFonts w:ascii="Arial" w:hAnsi="Arial" w:eastAsia="Microsoft YaHei"/>
-                <w:b w:val="0"/>
-                <w:i w:val="0"/>
-              </w:rPr>
-              <w:t>确认验收人不参与本候选开发（是/否）</w:t>
-            </w:r>
-          </w:p>
-        </w:tc>
-        <w:tc>
-          <w:tcPr>
-            <w:tcW w:type="dxa" w:w="4649"/>
-            <w:vAlign w:val="center"/>
-          </w:tcPr>
-          <w:p/>
-        </w:tc>
-      </w:tr>
-      <w:tr>
-        <w:tc>
-          <w:tcPr>
-            <w:tcW w:type="dxa" w:w="4649"/>
-            <w:vAlign w:val="center"/>
-          </w:tcPr>
-          <w:p>
-            <w:r>
-              <w:rPr>
-                <w:rFonts w:ascii="Arial" w:hAnsi="Arial" w:eastAsia="Microsoft YaHei"/>
-                <w:b w:val="0"/>
-                <w:i w:val="0"/>
-              </w:rPr>
-              <w:t>开始时间</w:t>
-            </w:r>
-          </w:p>
-        </w:tc>
-        <w:tc>
-          <w:tcPr>
-            <w:tcW w:type="dxa" w:w="4649"/>
-            <w:vAlign w:val="center"/>
-          </w:tcPr>
-          <w:p/>
-        </w:tc>
-      </w:tr>
-      <w:tr>
-        <w:tc>
-          <w:tcPr>
-            <w:tcW w:type="dxa" w:w="4649"/>
-            <w:vAlign w:val="center"/>
-          </w:tcPr>
-          <w:p>
-            <w:r>
-              <w:rPr>
-                <w:rFonts w:ascii="Arial" w:hAnsi="Arial" w:eastAsia="Microsoft YaHei"/>
-                <w:b w:val="0"/>
-                <w:i w:val="0"/>
-              </w:rPr>
-              <w:t>结束时间</w:t>
-            </w:r>
-          </w:p>
-        </w:tc>
-        <w:tc>
-          <w:tcPr>
-            <w:tcW w:type="dxa" w:w="4649"/>
-            <w:vAlign w:val="center"/>
-          </w:tcPr>
-          <w:p/>
-        </w:tc>
-      </w:tr>
-    </w:tbl>
-    <w:p>
-      <w:pPr>
-        <w:spacing w:after="0"/>
-      </w:pPr>
-    </w:p>
-    <w:p>
-      <w:pPr>
-        <w:pStyle w:val="Heading3"/>
-      </w:pPr>
-      <w:r>
-        <w:rPr>
-          <w:rFonts w:ascii="Arial" w:hAnsi="Arial" w:eastAsia="Microsoft YaHei"/>
-          <w:b w:val="0"/>
-          <w:i w:val="0"/>
-        </w:rPr>
-        <w:t>15.2 逐项结果</w:t>
-      </w:r>
-    </w:p>
-    <w:p>
-      <w:r>
-        <w:rPr>
-          <w:rFonts w:ascii="Arial" w:hAnsi="Arial" w:eastAsia="Microsoft YaHei"/>
-          <w:b w:val="0"/>
-          <w:i w:val="0"/>
-        </w:rPr>
-        <w:t xml:space="preserve">每项填写 </w:t>
-      </w:r>
-      <w:r>
-        <w:rPr>
-          <w:rFonts w:ascii="Consolas" w:hAnsi="Consolas" w:eastAsia="Microsoft YaHei"/>
-          <w:b w:val="0"/>
-          <w:i w:val="0"/>
-          <w:color w:val="464646"/>
-          <w:sz w:val="19"/>
-        </w:rPr>
-        <w:t>PASS</w:t>
-      </w:r>
-      <w:r>
-        <w:rPr>
-          <w:rFonts w:ascii="Arial" w:hAnsi="Arial" w:eastAsia="Microsoft YaHei"/>
-          <w:b w:val="0"/>
-          <w:i w:val="0"/>
-        </w:rPr>
-        <w:t xml:space="preserve"> 或 </w:t>
-      </w:r>
-      <w:r>
-        <w:rPr>
-          <w:rFonts w:ascii="Consolas" w:hAnsi="Consolas" w:eastAsia="Microsoft YaHei"/>
-          <w:b w:val="0"/>
-          <w:i w:val="0"/>
-          <w:color w:val="464646"/>
-          <w:sz w:val="19"/>
-        </w:rPr>
-        <w:t>FAIL</w:t>
-      </w:r>
-      <w:r>
-        <w:rPr>
-          <w:rFonts w:ascii="Arial" w:hAnsi="Arial" w:eastAsia="Microsoft YaHei"/>
-          <w:b w:val="0"/>
-          <w:i w:val="0"/>
-        </w:rPr>
-        <w:t>，并在失败时写明现象、发生时间和保留的日志路径。</w:t>
+        <w:t>演示前由部署人员完成启动，演示人员提前打开系统首页和样例目录，但不要预先导入本轮样例。建议按以下节奏展示：</w:t>
       </w:r>
     </w:p>
     <w:tbl>
@@ -3479,6 +2991,23 @@
                 <w:b/>
                 <w:i w:val="0"/>
               </w:rPr>
+              <w:t>时间</w:t>
+            </w:r>
+          </w:p>
+        </w:tc>
+        <w:tc>
+          <w:tcPr>
+            <w:tcW w:type="dxa" w:w="3099"/>
+            <w:vAlign w:val="center"/>
+            <w:shd w:fill="D9EAF7"/>
+          </w:tcPr>
+          <w:p>
+            <w:r>
+              <w:rPr>
+                <w:rFonts w:ascii="Arial" w:hAnsi="Arial" w:eastAsia="Microsoft YaHei"/>
+                <w:b/>
+                <w:i w:val="0"/>
+              </w:rPr>
               <w:t>操作</w:t>
             </w:r>
           </w:p>
@@ -3496,24 +3025,7 @@
                 <w:b/>
                 <w:i w:val="0"/>
               </w:rPr>
-              <w:t>结果</w:t>
-            </w:r>
-          </w:p>
-        </w:tc>
-        <w:tc>
-          <w:tcPr>
-            <w:tcW w:type="dxa" w:w="3099"/>
-            <w:vAlign w:val="center"/>
-            <w:shd w:fill="D9EAF7"/>
-          </w:tcPr>
-          <w:p>
-            <w:r>
-              <w:rPr>
-                <w:rFonts w:ascii="Arial" w:hAnsi="Arial" w:eastAsia="Microsoft YaHei"/>
-                <w:b/>
-                <w:i w:val="0"/>
-              </w:rPr>
-              <w:t>问题或证据位置</w:t>
+              <w:t>建议讲解</w:t>
             </w:r>
           </w:p>
         </w:tc>
@@ -3531,7 +3043,7 @@
                 <w:b w:val="0"/>
                 <w:i w:val="0"/>
               </w:rPr>
-              <w:t>仅按部署手册完成 ZIP/SHA-256 核对和全新解压</w:t>
+              <w:t>0–2 分钟</w:t>
             </w:r>
           </w:p>
         </w:tc>
@@ -3540,14 +3052,32 @@
             <w:tcW w:type="dxa" w:w="3099"/>
             <w:vAlign w:val="center"/>
           </w:tcPr>
-          <w:p/>
+          <w:p>
+            <w:r>
+              <w:rPr>
+                <w:rFonts w:ascii="Arial" w:hAnsi="Arial" w:eastAsia="Microsoft YaHei"/>
+                <w:b w:val="0"/>
+                <w:i w:val="0"/>
+              </w:rPr>
+              <w:t>登录并选择项目</w:t>
+            </w:r>
+          </w:p>
         </w:tc>
         <w:tc>
           <w:tcPr>
             <w:tcW w:type="dxa" w:w="3099"/>
             <w:vAlign w:val="center"/>
           </w:tcPr>
-          <w:p/>
+          <w:p>
+            <w:r>
+              <w:rPr>
+                <w:rFonts w:ascii="Arial" w:hAnsi="Arial" w:eastAsia="Microsoft YaHei"/>
+                <w:b w:val="0"/>
+                <w:i w:val="0"/>
+              </w:rPr>
+              <w:t>系统按项目隔离报警、人员和报告；操作身份来自登录会话。</w:t>
+            </w:r>
+          </w:p>
         </w:tc>
       </w:tr>
       <w:tr>
@@ -3563,7 +3093,7 @@
                 <w:b w:val="0"/>
                 <w:i w:val="0"/>
               </w:rPr>
-              <w:t>运行预检，能够理解并处理提示</w:t>
+              <w:t>2–5 分钟</w:t>
             </w:r>
           </w:p>
         </w:tc>
@@ -3572,14 +3102,32 @@
             <w:tcW w:type="dxa" w:w="3099"/>
             <w:vAlign w:val="center"/>
           </w:tcPr>
-          <w:p/>
+          <w:p>
+            <w:r>
+              <w:rPr>
+                <w:rFonts w:ascii="Arial" w:hAnsi="Arial" w:eastAsia="Microsoft YaHei"/>
+                <w:b w:val="0"/>
+                <w:i w:val="0"/>
+              </w:rPr>
+              <w:t>上传 300 行 CSV，查看映射和预览</w:t>
+            </w:r>
+          </w:p>
         </w:tc>
         <w:tc>
           <w:tcPr>
             <w:tcW w:type="dxa" w:w="3099"/>
             <w:vAlign w:val="center"/>
           </w:tcPr>
-          <w:p/>
+          <w:p>
+            <w:r>
+              <w:rPr>
+                <w:rFonts w:ascii="Arial" w:hAnsi="Arial" w:eastAsia="Microsoft YaHei"/>
+                <w:b w:val="0"/>
+                <w:i w:val="0"/>
+              </w:rPr>
+              <w:t>三种文件格式进入同一规范化流程；错误会定位到源行和字段，整批有效后才写入。</w:t>
+            </w:r>
+          </w:p>
         </w:tc>
       </w:tr>
       <w:tr>
@@ -3595,7 +3143,7 @@
                 <w:b w:val="0"/>
                 <w:i w:val="0"/>
               </w:rPr>
-              <w:t>启动系统并用浏览器打开中文页面</w:t>
+              <w:t>5–8 分钟</w:t>
             </w:r>
           </w:p>
         </w:tc>
@@ -3604,14 +3152,32 @@
             <w:tcW w:type="dxa" w:w="3099"/>
             <w:vAlign w:val="center"/>
           </w:tcPr>
-          <w:p/>
+          <w:p>
+            <w:r>
+              <w:rPr>
+                <w:rFonts w:ascii="Arial" w:hAnsi="Arial" w:eastAsia="Microsoft YaHei"/>
+                <w:b w:val="0"/>
+                <w:i w:val="0"/>
+              </w:rPr>
+              <w:t>启动分析并展示 Dashboard</w:t>
+            </w:r>
+          </w:p>
         </w:tc>
         <w:tc>
           <w:tcPr>
             <w:tcW w:type="dxa" w:w="3099"/>
             <w:vAlign w:val="center"/>
           </w:tcPr>
-          <w:p/>
+          <w:p>
+            <w:r>
+              <w:rPr>
+                <w:rFonts w:ascii="Arial" w:hAnsi="Arial" w:eastAsia="Microsoft YaHei"/>
+                <w:b w:val="0"/>
+                <w:i w:val="0"/>
+              </w:rPr>
+              <w:t>总数、状态、类型占比、趋势和表格读取当前项目数据库，不是固定图片或预置结果。</w:t>
+            </w:r>
+          </w:p>
         </w:tc>
       </w:tr>
       <w:tr>
@@ -3627,7 +3193,7 @@
                 <w:b w:val="0"/>
                 <w:i w:val="0"/>
               </w:rPr>
-              <w:t>使用临时密码首次登录并通过页面改密</w:t>
+              <w:t>8–11 分钟</w:t>
             </w:r>
           </w:p>
         </w:tc>
@@ -3636,14 +3202,32 @@
             <w:tcW w:type="dxa" w:w="3099"/>
             <w:vAlign w:val="center"/>
           </w:tcPr>
-          <w:p/>
+          <w:p>
+            <w:r>
+              <w:rPr>
+                <w:rFonts w:ascii="Arial" w:hAnsi="Arial" w:eastAsia="Microsoft YaHei"/>
+                <w:b w:val="0"/>
+                <w:i w:val="0"/>
+              </w:rPr>
+              <w:t>打开报警详情</w:t>
+            </w:r>
+          </w:p>
         </w:tc>
         <w:tc>
           <w:tcPr>
             <w:tcW w:type="dxa" w:w="3099"/>
             <w:vAlign w:val="center"/>
           </w:tcPr>
-          <w:p/>
+          <w:p>
+            <w:r>
+              <w:rPr>
+                <w:rFonts w:ascii="Arial" w:hAnsi="Arial" w:eastAsia="Microsoft YaHei"/>
+                <w:b w:val="0"/>
+                <w:i w:val="0"/>
+              </w:rPr>
+              <w:t>展示原始行、规则阈值、模型版本、原因建议和关联链；说明统计关联不是自动确认根因。</w:t>
+            </w:r>
+          </w:p>
         </w:tc>
       </w:tr>
       <w:tr>
@@ -3659,7 +3243,7 @@
                 <w:b w:val="0"/>
                 <w:i w:val="0"/>
               </w:rPr>
-              <w:t>创建或选择项目，导入 300 行样例并理解校验结果</w:t>
+              <w:t>11–13 分钟</w:t>
             </w:r>
           </w:p>
         </w:tc>
@@ -3668,14 +3252,32 @@
             <w:tcW w:type="dxa" w:w="3099"/>
             <w:vAlign w:val="center"/>
           </w:tcPr>
-          <w:p/>
+          <w:p>
+            <w:r>
+              <w:rPr>
+                <w:rFonts w:ascii="Arial" w:hAnsi="Arial" w:eastAsia="Microsoft YaHei"/>
+                <w:b w:val="0"/>
+                <w:i w:val="0"/>
+              </w:rPr>
+              <w:t>人工修订、分派并关闭一条报警</w:t>
+            </w:r>
+          </w:p>
         </w:tc>
         <w:tc>
           <w:tcPr>
             <w:tcW w:type="dxa" w:w="3099"/>
             <w:vAlign w:val="center"/>
           </w:tcPr>
-          <w:p/>
+          <w:p>
+            <w:r>
+              <w:rPr>
+                <w:rFonts w:ascii="Arial" w:hAnsi="Arial" w:eastAsia="Microsoft YaHei"/>
+                <w:b w:val="0"/>
+                <w:i w:val="0"/>
+              </w:rPr>
+              <w:t>算法原值保留，人工结论和处置轨迹独立留痕，便于后续复核。</w:t>
+            </w:r>
+          </w:p>
         </w:tc>
       </w:tr>
       <w:tr>
@@ -3691,26 +3293,10 @@
                 <w:b w:val="0"/>
                 <w:i w:val="0"/>
               </w:rPr>
-              <w:t>触发分析并查看总览、趋势、分布、详情和解释</w:t>
+              <w:t>13–15 分钟</w:t>
             </w:r>
           </w:p>
         </w:tc>
-        <w:tc>
-          <w:tcPr>
-            <w:tcW w:type="dxa" w:w="3099"/>
-            <w:vAlign w:val="center"/>
-          </w:tcPr>
-          <w:p/>
-        </w:tc>
-        <w:tc>
-          <w:tcPr>
-            <w:tcW w:type="dxa" w:w="3099"/>
-            <w:vAlign w:val="center"/>
-          </w:tcPr>
-          <w:p/>
-        </w:tc>
-      </w:tr>
-      <w:tr>
         <w:tc>
           <w:tcPr>
             <w:tcW w:type="dxa" w:w="3099"/>
@@ -3723,26 +3309,10 @@
                 <w:b w:val="0"/>
                 <w:i w:val="0"/>
               </w:rPr>
-              <w:t>完成人工分类修订、责任人分派和状态处置</w:t>
+              <w:t>下载 PDF/XLSX，展示备份状态</w:t>
             </w:r>
           </w:p>
         </w:tc>
-        <w:tc>
-          <w:tcPr>
-            <w:tcW w:type="dxa" w:w="3099"/>
-            <w:vAlign w:val="center"/>
-          </w:tcPr>
-          <w:p/>
-        </w:tc>
-        <w:tc>
-          <w:tcPr>
-            <w:tcW w:type="dxa" w:w="3099"/>
-            <w:vAlign w:val="center"/>
-          </w:tcPr>
-          <w:p/>
-        </w:tc>
-      </w:tr>
-      <w:tr>
         <w:tc>
           <w:tcPr>
             <w:tcW w:type="dxa" w:w="3099"/>
@@ -3755,427 +3325,9 @@
                 <w:b w:val="0"/>
                 <w:i w:val="0"/>
               </w:rPr>
-              <w:t>下载并打开 PDF 与 XLSX 业务报告</w:t>
+              <w:t>页面、报告和审计来自同一业务事实；备份需由脚本执行完整校验和隔离恢复。</w:t>
             </w:r>
           </w:p>
-        </w:tc>
-        <w:tc>
-          <w:tcPr>
-            <w:tcW w:type="dxa" w:w="3099"/>
-            <w:vAlign w:val="center"/>
-          </w:tcPr>
-          <w:p/>
-        </w:tc>
-        <w:tc>
-          <w:tcPr>
-            <w:tcW w:type="dxa" w:w="3099"/>
-            <w:vAlign w:val="center"/>
-          </w:tcPr>
-          <w:p/>
-        </w:tc>
-      </w:tr>
-      <w:tr>
-        <w:tc>
-          <w:tcPr>
-            <w:tcW w:type="dxa" w:w="3099"/>
-            <w:vAlign w:val="center"/>
-          </w:tcPr>
-          <w:p>
-            <w:r>
-              <w:rPr>
-                <w:rFonts w:ascii="Arial" w:hAnsi="Arial" w:eastAsia="Microsoft YaHei"/>
-                <w:b w:val="0"/>
-                <w:i w:val="0"/>
-              </w:rPr>
-              <w:t>查看数据与备份面板，由部署步骤创建并校验备份</w:t>
-            </w:r>
-          </w:p>
-        </w:tc>
-        <w:tc>
-          <w:tcPr>
-            <w:tcW w:type="dxa" w:w="3099"/>
-            <w:vAlign w:val="center"/>
-          </w:tcPr>
-          <w:p/>
-        </w:tc>
-        <w:tc>
-          <w:tcPr>
-            <w:tcW w:type="dxa" w:w="3099"/>
-            <w:vAlign w:val="center"/>
-          </w:tcPr>
-          <w:p/>
-        </w:tc>
-      </w:tr>
-      <w:tr>
-        <w:tc>
-          <w:tcPr>
-            <w:tcW w:type="dxa" w:w="3099"/>
-            <w:vAlign w:val="center"/>
-          </w:tcPr>
-          <w:p>
-            <w:r>
-              <w:rPr>
-                <w:rFonts w:ascii="Arial" w:hAnsi="Arial" w:eastAsia="Microsoft YaHei"/>
-                <w:b w:val="0"/>
-                <w:i w:val="0"/>
-              </w:rPr>
-              <w:t>按手册完成隔离恢复验证并理解“不覆盖当前库”边界</w:t>
-            </w:r>
-          </w:p>
-        </w:tc>
-        <w:tc>
-          <w:tcPr>
-            <w:tcW w:type="dxa" w:w="3099"/>
-            <w:vAlign w:val="center"/>
-          </w:tcPr>
-          <w:p/>
-        </w:tc>
-        <w:tc>
-          <w:tcPr>
-            <w:tcW w:type="dxa" w:w="3099"/>
-            <w:vAlign w:val="center"/>
-          </w:tcPr>
-          <w:p/>
-        </w:tc>
-      </w:tr>
-      <w:tr>
-        <w:tc>
-          <w:tcPr>
-            <w:tcW w:type="dxa" w:w="3099"/>
-            <w:vAlign w:val="center"/>
-          </w:tcPr>
-          <w:p>
-            <w:r>
-              <w:rPr>
-                <w:rFonts w:ascii="Arial" w:hAnsi="Arial" w:eastAsia="Microsoft YaHei"/>
-                <w:b w:val="0"/>
-                <w:i w:val="0"/>
-              </w:rPr>
-              <w:t>停止系统，确认网页不可继续写入且数据和备份仍保留</w:t>
-            </w:r>
-          </w:p>
-        </w:tc>
-        <w:tc>
-          <w:tcPr>
-            <w:tcW w:type="dxa" w:w="3099"/>
-            <w:vAlign w:val="center"/>
-          </w:tcPr>
-          <w:p/>
-        </w:tc>
-        <w:tc>
-          <w:tcPr>
-            <w:tcW w:type="dxa" w:w="3099"/>
-            <w:vAlign w:val="center"/>
-          </w:tcPr>
-          <w:p/>
-        </w:tc>
-      </w:tr>
-      <w:tr>
-        <w:tc>
-          <w:tcPr>
-            <w:tcW w:type="dxa" w:w="3099"/>
-            <w:vAlign w:val="center"/>
-          </w:tcPr>
-          <w:p>
-            <w:r>
-              <w:rPr>
-                <w:rFonts w:ascii="Arial" w:hAnsi="Arial" w:eastAsia="Microsoft YaHei"/>
-                <w:b w:val="0"/>
-                <w:i w:val="0"/>
-              </w:rPr>
-              <w:t>全程无需开发人员口头补充或修改命令</w:t>
-            </w:r>
-          </w:p>
-        </w:tc>
-        <w:tc>
-          <w:tcPr>
-            <w:tcW w:type="dxa" w:w="3099"/>
-            <w:vAlign w:val="center"/>
-          </w:tcPr>
-          <w:p/>
-        </w:tc>
-        <w:tc>
-          <w:tcPr>
-            <w:tcW w:type="dxa" w:w="3099"/>
-            <w:vAlign w:val="center"/>
-          </w:tcPr>
-          <w:p/>
-        </w:tc>
-      </w:tr>
-      <w:tr>
-        <w:tc>
-          <w:tcPr>
-            <w:tcW w:type="dxa" w:w="3099"/>
-            <w:vAlign w:val="center"/>
-          </w:tcPr>
-          <w:p>
-            <w:r>
-              <w:rPr>
-                <w:rFonts w:ascii="Arial" w:hAnsi="Arial" w:eastAsia="Microsoft YaHei"/>
-                <w:b w:val="0"/>
-                <w:i w:val="0"/>
-              </w:rPr>
-              <w:t>中文无乱码，页面无阻断错误，电脑和网络无明显异常</w:t>
-            </w:r>
-          </w:p>
-        </w:tc>
-        <w:tc>
-          <w:tcPr>
-            <w:tcW w:type="dxa" w:w="3099"/>
-            <w:vAlign w:val="center"/>
-          </w:tcPr>
-          <w:p/>
-        </w:tc>
-        <w:tc>
-          <w:tcPr>
-            <w:tcW w:type="dxa" w:w="3099"/>
-            <w:vAlign w:val="center"/>
-          </w:tcPr>
-          <w:p/>
-        </w:tc>
-      </w:tr>
-    </w:tbl>
-    <w:p>
-      <w:pPr>
-        <w:spacing w:after="0"/>
-      </w:pPr>
-    </w:p>
-    <w:p>
-      <w:pPr>
-        <w:pStyle w:val="Heading3"/>
-      </w:pPr>
-      <w:r>
-        <w:rPr>
-          <w:rFonts w:ascii="Arial" w:hAnsi="Arial" w:eastAsia="Microsoft YaHei"/>
-          <w:b w:val="0"/>
-          <w:i w:val="0"/>
-        </w:rPr>
-        <w:t>15.3 缺陷与结论</w:t>
-      </w:r>
-    </w:p>
-    <w:tbl>
-      <w:tblPr>
-        <w:tblStyle w:val="TableGrid"/>
-        <w:tblW w:type="auto" w:w="0"/>
-        <w:tblLayout w:type="autofit"/>
-        <w:tblLook w:firstColumn="1" w:firstRow="1" w:lastColumn="0" w:lastRow="0" w:noHBand="0" w:noVBand="1" w:val="04A0"/>
-      </w:tblPr>
-      <w:tblGrid>
-        <w:gridCol w:w="4649"/>
-        <w:gridCol w:w="4649"/>
-      </w:tblGrid>
-      <w:tr>
-        <w:trPr>
-          <w:tblHeader w:val="true"/>
-        </w:trPr>
-        <w:tc>
-          <w:tcPr>
-            <w:tcW w:type="dxa" w:w="4649"/>
-            <w:vAlign w:val="center"/>
-            <w:shd w:fill="D9EAF7"/>
-          </w:tcPr>
-          <w:p>
-            <w:r>
-              <w:rPr>
-                <w:rFonts w:ascii="Arial" w:hAnsi="Arial" w:eastAsia="Microsoft YaHei"/>
-                <w:b/>
-                <w:i w:val="0"/>
-              </w:rPr>
-              <w:t>字段</w:t>
-            </w:r>
-          </w:p>
-        </w:tc>
-        <w:tc>
-          <w:tcPr>
-            <w:tcW w:type="dxa" w:w="4649"/>
-            <w:vAlign w:val="center"/>
-            <w:shd w:fill="D9EAF7"/>
-          </w:tcPr>
-          <w:p>
-            <w:r>
-              <w:rPr>
-                <w:rFonts w:ascii="Arial" w:hAnsi="Arial" w:eastAsia="Microsoft YaHei"/>
-                <w:b/>
-                <w:i w:val="0"/>
-              </w:rPr>
-              <w:t>人工填写</w:t>
-            </w:r>
-          </w:p>
-        </w:tc>
-      </w:tr>
-      <w:tr>
-        <w:tc>
-          <w:tcPr>
-            <w:tcW w:type="dxa" w:w="4649"/>
-            <w:vAlign w:val="center"/>
-          </w:tcPr>
-          <w:p>
-            <w:r>
-              <w:rPr>
-                <w:rFonts w:ascii="Arial" w:hAnsi="Arial" w:eastAsia="Microsoft YaHei"/>
-                <w:b w:val="0"/>
-                <w:i w:val="0"/>
-              </w:rPr>
-              <w:t>阻断缺陷（必须为 0 才可通过）</w:t>
-            </w:r>
-          </w:p>
-        </w:tc>
-        <w:tc>
-          <w:tcPr>
-            <w:tcW w:type="dxa" w:w="4649"/>
-            <w:vAlign w:val="center"/>
-          </w:tcPr>
-          <w:p/>
-        </w:tc>
-      </w:tr>
-      <w:tr>
-        <w:tc>
-          <w:tcPr>
-            <w:tcW w:type="dxa" w:w="4649"/>
-            <w:vAlign w:val="center"/>
-          </w:tcPr>
-          <w:p>
-            <w:r>
-              <w:rPr>
-                <w:rFonts w:ascii="Arial" w:hAnsi="Arial" w:eastAsia="Microsoft YaHei"/>
-                <w:b w:val="0"/>
-                <w:i w:val="0"/>
-              </w:rPr>
-              <w:t>严重缺陷（必须为 0 才可通过）</w:t>
-            </w:r>
-          </w:p>
-        </w:tc>
-        <w:tc>
-          <w:tcPr>
-            <w:tcW w:type="dxa" w:w="4649"/>
-            <w:vAlign w:val="center"/>
-          </w:tcPr>
-          <w:p/>
-        </w:tc>
-      </w:tr>
-      <w:tr>
-        <w:tc>
-          <w:tcPr>
-            <w:tcW w:type="dxa" w:w="4649"/>
-            <w:vAlign w:val="center"/>
-          </w:tcPr>
-          <w:p>
-            <w:r>
-              <w:rPr>
-                <w:rFonts w:ascii="Arial" w:hAnsi="Arial" w:eastAsia="Microsoft YaHei"/>
-                <w:b w:val="0"/>
-                <w:i w:val="0"/>
-              </w:rPr>
-              <w:t>一般问题/歧义</w:t>
-            </w:r>
-          </w:p>
-        </w:tc>
-        <w:tc>
-          <w:tcPr>
-            <w:tcW w:type="dxa" w:w="4649"/>
-            <w:vAlign w:val="center"/>
-          </w:tcPr>
-          <w:p/>
-        </w:tc>
-      </w:tr>
-      <w:tr>
-        <w:tc>
-          <w:tcPr>
-            <w:tcW w:type="dxa" w:w="4649"/>
-            <w:vAlign w:val="center"/>
-          </w:tcPr>
-          <w:p>
-            <w:r>
-              <w:rPr>
-                <w:rFonts w:ascii="Arial" w:hAnsi="Arial" w:eastAsia="Microsoft YaHei"/>
-                <w:b w:val="0"/>
-                <w:i w:val="0"/>
-              </w:rPr>
-              <w:t>说明书无需口头补充（是/否）</w:t>
-            </w:r>
-          </w:p>
-        </w:tc>
-        <w:tc>
-          <w:tcPr>
-            <w:tcW w:type="dxa" w:w="4649"/>
-            <w:vAlign w:val="center"/>
-          </w:tcPr>
-          <w:p/>
-        </w:tc>
-      </w:tr>
-      <w:tr>
-        <w:tc>
-          <w:tcPr>
-            <w:tcW w:type="dxa" w:w="4649"/>
-            <w:vAlign w:val="center"/>
-          </w:tcPr>
-          <w:p>
-            <w:r>
-              <w:rPr>
-                <w:rFonts w:ascii="Arial" w:hAnsi="Arial" w:eastAsia="Microsoft YaHei"/>
-                <w:b w:val="0"/>
-                <w:i w:val="0"/>
-              </w:rPr>
-              <w:t>最终结论（PASS/FAIL）</w:t>
-            </w:r>
-          </w:p>
-        </w:tc>
-        <w:tc>
-          <w:tcPr>
-            <w:tcW w:type="dxa" w:w="4649"/>
-            <w:vAlign w:val="center"/>
-          </w:tcPr>
-          <w:p/>
-        </w:tc>
-      </w:tr>
-      <w:tr>
-        <w:tc>
-          <w:tcPr>
-            <w:tcW w:type="dxa" w:w="4649"/>
-            <w:vAlign w:val="center"/>
-          </w:tcPr>
-          <w:p>
-            <w:r>
-              <w:rPr>
-                <w:rFonts w:ascii="Arial" w:hAnsi="Arial" w:eastAsia="Microsoft YaHei"/>
-                <w:b w:val="0"/>
-                <w:i w:val="0"/>
-              </w:rPr>
-              <w:t>验收人签名</w:t>
-            </w:r>
-          </w:p>
-        </w:tc>
-        <w:tc>
-          <w:tcPr>
-            <w:tcW w:type="dxa" w:w="4649"/>
-            <w:vAlign w:val="center"/>
-          </w:tcPr>
-          <w:p/>
-        </w:tc>
-      </w:tr>
-      <w:tr>
-        <w:tc>
-          <w:tcPr>
-            <w:tcW w:type="dxa" w:w="4649"/>
-            <w:vAlign w:val="center"/>
-          </w:tcPr>
-          <w:p>
-            <w:r>
-              <w:rPr>
-                <w:rFonts w:ascii="Arial" w:hAnsi="Arial" w:eastAsia="Microsoft YaHei"/>
-                <w:b w:val="0"/>
-                <w:i w:val="0"/>
-              </w:rPr>
-              <w:t>签署日期</w:t>
-            </w:r>
-          </w:p>
-        </w:tc>
-        <w:tc>
-          <w:tcPr>
-            <w:tcW w:type="dxa" w:w="4649"/>
-            <w:vAlign w:val="center"/>
-          </w:tcPr>
-          <w:p/>
         </w:tc>
       </w:tr>
     </w:tbl>
@@ -4191,7 +3343,66 @@
           <w:b w:val="0"/>
           <w:i w:val="0"/>
         </w:rPr>
-        <w:t xml:space="preserve">本记录为 </w:t>
+        <w:t>若需要演示错误处理，可另选一个随包无效样例。页面应显示中文错误并禁止确认导入；完成后回到有效样例，不要现场修改程序或数据库。演示前应关闭个人通知，确认浏览器缩放为 100%，并避免在投屏中打开密码文件、模型密钥、日志或真实业务数据。</w:t>
+      </w:r>
+    </w:p>
+    <w:p>
+      <w:pPr>
+        <w:pStyle w:val="Heading2"/>
+      </w:pPr>
+      <w:r>
+        <w:rPr>
+          <w:rFonts w:ascii="Arial" w:hAnsi="Arial" w:eastAsia="Microsoft YaHei"/>
+          <w:b w:val="0"/>
+          <w:i w:val="0"/>
+        </w:rPr>
+        <w:t>16. 常见评审问题与解释口径</w:t>
+      </w:r>
+    </w:p>
+    <w:p>
+      <w:pPr>
+        <w:pStyle w:val="Heading3"/>
+      </w:pPr>
+      <w:r>
+        <w:rPr>
+          <w:rFonts w:ascii="Arial" w:hAnsi="Arial" w:eastAsia="Microsoft YaHei"/>
+          <w:b w:val="0"/>
+          <w:i w:val="0"/>
+        </w:rPr>
+        <w:t>16.1 为什么不是简单查表</w:t>
+      </w:r>
+    </w:p>
+    <w:p>
+      <w:r>
+        <w:rPr>
+          <w:rFonts w:ascii="Arial" w:hAnsi="Arial" w:eastAsia="Microsoft YaHei"/>
+          <w:b w:val="0"/>
+          <w:i w:val="0"/>
+        </w:rPr>
+        <w:t>系统对每批新记录实际计算相邻时间差、状态转换率、持续时间、episode 转移统计、文本向量和结构特征。未见位号、时间平移、记录乱序和随机负控已有测试；算法不读取文件名、项目名或演示场景名决定结果。</w:t>
+      </w:r>
+    </w:p>
+    <w:p>
+      <w:pPr>
+        <w:pStyle w:val="Heading3"/>
+      </w:pPr>
+      <w:r>
+        <w:rPr>
+          <w:rFonts w:ascii="Arial" w:hAnsi="Arial" w:eastAsia="Microsoft YaHei"/>
+          <w:b w:val="0"/>
+          <w:i w:val="0"/>
+        </w:rPr>
+        <w:t>16.2 模型先进性体现在哪里</w:t>
+      </w:r>
+    </w:p>
+    <w:p>
+      <w:r>
+        <w:rPr>
+          <w:rFonts w:ascii="Arial" w:hAnsi="Arial" w:eastAsia="Microsoft YaHei"/>
+          <w:b w:val="0"/>
+          <w:i w:val="0"/>
+        </w:rPr>
+        <w:t xml:space="preserve">先进性在于把可复算的工程规则、Markov 顺序关联、文本 LinearSVC 和结构 AdaBoost 组合，并用双分支一致、判别间隔、保守语义和类别专用门禁控制接受范围。证据充分时给出建议，证据冲突或不足时明确返回 </w:t>
       </w:r>
       <w:r>
         <w:rPr>
@@ -4201,7 +3412,7 @@
           <w:color w:val="464646"/>
           <w:sz w:val="19"/>
         </w:rPr>
-        <w:t>PASS</w:t>
+        <w:t>UNKNOWN</w:t>
       </w:r>
       <w:r>
         <w:rPr>
@@ -4209,43 +3420,158 @@
           <w:b w:val="0"/>
           <w:i w:val="0"/>
         </w:rPr>
-        <w:t xml:space="preserve"> 只授权把受测候选提交和同一 SHA-256 构件提交到后续发布审批，不自动授权 </w:t>
+        <w:t>，避免强制输出看似确定的答案。算法原值、人工修订和处置记录分层保留，使模型能够迭代而不破坏业务追溯。</w:t>
       </w:r>
-      <w:r>
-        <w:rPr>
-          <w:rFonts w:ascii="Consolas" w:hAnsi="Consolas" w:eastAsia="Microsoft YaHei"/>
-          <w:b w:val="0"/>
-          <w:i w:val="0"/>
-          <w:color w:val="464646"/>
-          <w:sz w:val="19"/>
-        </w:rPr>
-        <w:t>dev → main</w:t>
-      </w:r>
+    </w:p>
+    <w:p>
+      <w:pPr>
+        <w:pStyle w:val="Heading3"/>
+      </w:pPr>
       <w:r>
         <w:rPr>
           <w:rFonts w:ascii="Arial" w:hAnsi="Arial" w:eastAsia="Microsoft YaHei"/>
           <w:b w:val="0"/>
           <w:i w:val="0"/>
         </w:rPr>
-        <w:t xml:space="preserve"> 合并，也不自动授权创建 </w:t>
+        <w:t>16.3 为什么样例数据仍有现实意义</w:t>
       </w:r>
-      <w:r>
-        <w:rPr>
-          <w:rFonts w:ascii="Consolas" w:hAnsi="Consolas" w:eastAsia="Microsoft YaHei"/>
-          <w:b w:val="0"/>
-          <w:i w:val="0"/>
-          <w:color w:val="464646"/>
-          <w:sz w:val="19"/>
-        </w:rPr>
-        <w:t>v1.0.0</w:t>
-      </w:r>
+    </w:p>
+    <w:p>
       <w:r>
         <w:rPr>
           <w:rFonts w:ascii="Arial" w:hAnsi="Arial" w:eastAsia="Microsoft YaHei"/>
           <w:b w:val="0"/>
           <w:i w:val="0"/>
         </w:rPr>
-        <w:t xml:space="preserve"> 正式标签。手册、包内容或业务流程发生实质变化时，必须重新执行终验。</w:t>
+        <w:t>样例不是用于证明某一工厂的准确率，而是覆盖真实系统必须处理的技术形态：多编码、多格式、不同长度、重复、抖动、短时恢复、持续报警、不同原因语义、缺失值、非法枚举、错误时间和超限输入。它能验证输入治理、模型计算、错误阻断、数据库联动、报告和恢复链是否真实工作。现场效果评估仍需经授权的代表性标注数据。</w:t>
+      </w:r>
+    </w:p>
+    <w:p>
+      <w:pPr>
+        <w:pStyle w:val="Heading3"/>
+      </w:pPr>
+      <w:r>
+        <w:rPr>
+          <w:rFonts w:ascii="Arial" w:hAnsi="Arial" w:eastAsia="Microsoft YaHei"/>
+          <w:b w:val="0"/>
+          <w:i w:val="0"/>
+        </w:rPr>
+        <w:t>16.4 为什么有些记录显示未知</w:t>
+      </w:r>
+    </w:p>
+    <w:p>
+      <w:r>
+        <w:rPr>
+          <w:rFonts w:ascii="Arial" w:hAnsi="Arial" w:eastAsia="Microsoft YaHei"/>
+          <w:b w:val="0"/>
+          <w:i w:val="0"/>
+        </w:rPr>
+        <w:t>未知是设计结果，不是程序失败。两个监督分支不一致、分数或间隔不足、描述明确表示原因不确定时，系统主动要求人工复核。这样可以降低有限标签条件下把弱证据误写为确定原因的风险。</w:t>
+      </w:r>
+    </w:p>
+    <w:p>
+      <w:pPr>
+        <w:pStyle w:val="Heading3"/>
+      </w:pPr>
+      <w:r>
+        <w:rPr>
+          <w:rFonts w:ascii="Arial" w:hAnsi="Arial" w:eastAsia="Microsoft YaHei"/>
+          <w:b w:val="0"/>
+          <w:i w:val="0"/>
+        </w:rPr>
+        <w:t>16.5 能否自动控制设备或确认根因</w:t>
+      </w:r>
+    </w:p>
+    <w:p>
+      <w:r>
+        <w:rPr>
+          <w:rFonts w:ascii="Arial" w:hAnsi="Arial" w:eastAsia="Microsoft YaHei"/>
+          <w:b w:val="0"/>
+          <w:i w:val="0"/>
+        </w:rPr>
+        <w:t>不能。当前版本处理用户主动导入的离线报警文件，只输出分析建议和统计关联，不向 DCS、PLC、联锁、门禁或通知平台写入控制指令。根因由具备现场信息和职责的人员确认。</w:t>
+      </w:r>
+    </w:p>
+    <w:p>
+      <w:pPr>
+        <w:pStyle w:val="Heading3"/>
+      </w:pPr>
+      <w:r>
+        <w:rPr>
+          <w:rFonts w:ascii="Arial" w:hAnsi="Arial" w:eastAsia="Microsoft YaHei"/>
+          <w:b w:val="0"/>
+          <w:i w:val="0"/>
+        </w:rPr>
+        <w:t>16.6 如何证明不是静态演示页面</w:t>
+      </w:r>
+    </w:p>
+    <w:p>
+      <w:r>
+        <w:rPr>
+          <w:rFonts w:ascii="Arial" w:hAnsi="Arial" w:eastAsia="Microsoft YaHei"/>
+          <w:b w:val="0"/>
+          <w:i w:val="0"/>
+        </w:rPr>
+        <w:t>可在新项目中导入另一份样例或人工补录一条报警，再刷新 Dashboard。总数、趋势、占比、列表和报告会随数据库事实变化；无效文件则被页面阻断。演示人员不应通过修改数据库或源码来证明这一点。</w:t>
+      </w:r>
+    </w:p>
+    <w:p>
+      <w:pPr>
+        <w:pStyle w:val="Heading2"/>
+      </w:pPr>
+      <w:r>
+        <w:rPr>
+          <w:rFonts w:ascii="Arial" w:hAnsi="Arial" w:eastAsia="Microsoft YaHei"/>
+          <w:b w:val="0"/>
+          <w:i w:val="0"/>
+        </w:rPr>
+        <w:t>17. 验收记录方式</w:t>
+      </w:r>
+    </w:p>
+    <w:p>
+      <w:r>
+        <w:rPr>
+          <w:rFonts w:ascii="Arial" w:hAnsi="Arial" w:eastAsia="Microsoft YaHei"/>
+          <w:b w:val="0"/>
+          <w:i w:val="0"/>
+        </w:rPr>
+        <w:t>完整自动验收已经把源码提交、Windows ZIP、SHA-256、浏览器页面、业务闭环、报告、备份恢复及停止结果绑定在阶段证据中。人工审查可以采用两种方式：</w:t>
+      </w:r>
+    </w:p>
+    <w:p>
+      <w:pPr>
+        <w:pStyle w:val="ListNumber"/>
+      </w:pPr>
+      <w:r>
+        <w:rPr>
+          <w:rFonts w:ascii="Arial" w:hAnsi="Arial" w:eastAsia="Microsoft YaHei"/>
+          <w:b w:val="0"/>
+          <w:i w:val="0"/>
+        </w:rPr>
+        <w:t>需要逐项签章的组织，使用本手册各章节作为检查清单，在组织自己的验收单中登记人员、环境、问题和签章。</w:t>
+      </w:r>
+    </w:p>
+    <w:p>
+      <w:pPr>
+        <w:pStyle w:val="ListNumber"/>
+      </w:pPr>
+      <w:r>
+        <w:rPr>
+          <w:rFonts w:ascii="Arial" w:hAnsi="Arial" w:eastAsia="Microsoft YaHei"/>
+          <w:b w:val="0"/>
+          <w:i w:val="0"/>
+        </w:rPr>
+        <w:t>时间受限且项目负责人已实际确认可行性的组织，可形成结果性书面声明，至少保留声明原文、受审候选提交、已验证 ZIP 的 SHA-256、记录时间和是否授权正式发布；不得由系统推测姓名、设备版本或未明确给出的逐项结果。</w:t>
+      </w:r>
+    </w:p>
+    <w:p>
+      <w:r>
+        <w:rPr>
+          <w:rFonts w:ascii="Arial" w:hAnsi="Arial" w:eastAsia="Microsoft YaHei"/>
+          <w:b w:val="0"/>
+          <w:i w:val="0"/>
+        </w:rPr>
+        <w:t>若后续修改业务源码、数据库迁移、算法、样例、部署脚本或用户可见业务流程，原验收结论失效，必须重新构建并按变更影响范围复验。仅补充说明、专利草案和发布元数据时，应通过静态门槛确认没有产品路径变化。</w:t>
       </w:r>
     </w:p>
     <w:sectPr>

</xml_diff>